<commit_message>
se termino las infracciones
</commit_message>
<xml_diff>
--- a/diagrama/Casos de uso/Formatos Casos de uso/CU-01.docx
+++ b/diagrama/Casos de uso/Formatos Casos de uso/CU-01.docx
@@ -604,6 +604,16 @@
                 <w:lang w:eastAsia="es-CO"/>
               </w:rPr>
             </w:pPr>
+            <w:r>
+              <w:rPr>
+                <w:rFonts w:eastAsia="Times New Roman" w:cstheme="minorHAnsi"/>
+                <w:color w:val="000000"/>
+                <w:sz w:val="20"/>
+                <w:szCs w:val="20"/>
+                <w:lang w:eastAsia="es-CO"/>
+              </w:rPr>
+              <w:t>Sea un usuario o administrador pasa el menú para gestionar los equipos, también en este menú puede crear cuentas de jugadores o administrador (solo es un único administrador)</w:t>
+            </w:r>
           </w:p>
           <w:p>
             <w:pPr>
@@ -780,20 +790,31 @@
             <w:vMerge w:val="restart"/>
             <w:shd w:val="clear" w:color="auto" w:fill="auto"/>
             <w:noWrap/>
-            <w:vAlign w:val="bottom"/>
-            <w:hideMark/>
-          </w:tcPr>
-          <w:p>
-            <w:pPr>
-              <w:spacing w:after="0" w:line="240" w:lineRule="auto"/>
-              <w:rPr>
-                <w:rFonts w:eastAsia="Times New Roman" w:cstheme="minorHAnsi"/>
-                <w:color w:val="000000"/>
-                <w:sz w:val="20"/>
-                <w:szCs w:val="20"/>
-                <w:lang w:eastAsia="es-CO"/>
-              </w:rPr>
-            </w:pPr>
+            <w:vAlign w:val="center"/>
+            <w:hideMark/>
+          </w:tcPr>
+          <w:p>
+            <w:pPr>
+              <w:spacing w:after="0" w:line="240" w:lineRule="auto"/>
+              <w:jc w:val="center"/>
+              <w:rPr>
+                <w:rFonts w:eastAsia="Times New Roman" w:cstheme="minorHAnsi"/>
+                <w:color w:val="000000"/>
+                <w:sz w:val="20"/>
+                <w:szCs w:val="20"/>
+                <w:lang w:eastAsia="es-CO"/>
+              </w:rPr>
+            </w:pPr>
+            <w:r>
+              <w:rPr>
+                <w:rFonts w:eastAsia="Times New Roman" w:cstheme="minorHAnsi"/>
+                <w:color w:val="000000"/>
+                <w:sz w:val="20"/>
+                <w:szCs w:val="20"/>
+                <w:lang w:eastAsia="es-CO"/>
+              </w:rPr>
+              <w:t>Si no existe en la base de datos crear su correspondiente usuario</w:t>
+            </w:r>
           </w:p>
         </w:tc>
       </w:tr>
@@ -977,7 +998,19 @@
                 <w:szCs w:val="20"/>
                 <w:lang w:eastAsia="es-CO"/>
               </w:rPr>
-              <w:t>Acción  de los Actores</w:t>
+              <w:t>Acción de</w:t>
+            </w:r>
+            <w:r>
+              <w:rPr>
+                <w:rFonts w:eastAsia="Times New Roman" w:cstheme="minorHAnsi"/>
+                <w:b/>
+                <w:bCs/>
+                <w:color w:val="000000"/>
+                <w:sz w:val="20"/>
+                <w:szCs w:val="20"/>
+                <w:lang w:eastAsia="es-CO"/>
+              </w:rPr>
+              <w:t xml:space="preserve"> los Actores</w:t>
             </w:r>
           </w:p>
         </w:tc>
@@ -2161,6 +2194,16 @@
                 <w:lang w:eastAsia="es-CO"/>
               </w:rPr>
             </w:pPr>
+            <w:r>
+              <w:rPr>
+                <w:rFonts w:eastAsia="Times New Roman" w:cstheme="minorHAnsi"/>
+                <w:color w:val="000000"/>
+                <w:sz w:val="20"/>
+                <w:szCs w:val="20"/>
+                <w:lang w:eastAsia="es-CO"/>
+              </w:rPr>
+              <w:t>No hay</w:t>
+            </w:r>
           </w:p>
         </w:tc>
       </w:tr>

</xml_diff>